<commit_message>
Revise Meypak files so internal monitoring starts after the permit.
Periodic wastewater sampling is not required during the temporary operating certificate. The tracking workbook and report now start that schedule only after the environmental permit is issued.

Co-authored-by: iremalisan <iremalisan@users.noreply.github.com>
</commit_message>
<xml_diff>
--- a/cikti/Meypak_calisma_raporu.docx
+++ b/cikti/Meypak_calisma_raporu.docx
@@ -73,7 +73,7 @@
           <w:i w:val="0"/>
           <w:sz w:val="22"/>
         </w:rPr>
-        <w:t>Bu rapor, tesise ait dört belgenin okunmasıyla hazırlandı: 10.09.2025 tarihli atıksu arıtma tesisi kimlik belgesi, 15.08.2025 tarihli proje onayı ve Ek-1 formu, 04.09.2026 tarihli iç tetkik raporu ve 24.09.2026 tarihli aylık faaliyet raporu. Sahaya gidilmedi, debi ölçülmedi, numune alınmadı. Eylül 2026’da alındığı yazılan iç izlemenin analiz sonucu bu sette yok. Bu yüzden tesisin Tablo 5.9’a uyduğu veya uymadığı bu raporda söylenmez.</w:t>
+        <w:t>Bu rapor, tesise ait dört belgenin okunmasıyla hazırlandı: 10.09.2025 tarihli atıksu arıtma tesisi kimlik belgesi, 15.08.2025 tarihli proje onayı ve Ek-1 formu, 04.09.2026 tarihli iç tetkik raporu ve 24.09.2026 tarihli aylık faaliyet raporu. Sahaya gidilmedi, debi ölçülmedi. Tesis geçici faaliyet belgesi aşamasındadır. Periyodik iç izleme bu aşamada alınmaz ve tesisin iç izlemesi yoktur. İç izleme, atıksu deşarjı konulu çevre izin belgesi düzenlendikten sonra başlar. Bu yüzden tesisin Tablo 5.9’a uyup uymadığı henüz iç izleme ile söylenemez.</w:t>
       </w:r>
     </w:p>
     <w:p>
@@ -1588,7 +1588,7 @@
           <w:i w:val="0"/>
           <w:sz w:val="22"/>
         </w:rPr>
-        <w:t>Kurulu kapasite 90 m³/gün olduğu için beklenen fiili debi bandı 51-200 m³/gündür. Bu bantta iç izleme iki ayda bir, il müdürlüğünün denetime esas asgari sıklığı altı ayda birdir. Numune, debiyle orantılı iki saatlik kompozittir ve numune alma yetkisi olan laboratuvar tarafından alınır. Anlık numune iç izlemeyi kapatmaz. KOİ veya AKM anlık sonucu limiti yüzde 20’den fazla aşarsa yaptırıma esas değerlendirilir.</w:t>
+        <w:t>Kurulu kapasite 90 m³/gün olduğu için, izin çıktıktan sonra beklenen fiili debi bandı 51-200 m³/gündür. Bu bantta iç izleme iki ayda bir, il müdürlüğünün denetime esas asgari sıklığı altı ayda birdir. Sıklık çevre izin belgesinin ekinde yazar. Ek farklı bir süre verirse ek uygulanır. Numune, debiyle orantılı iki saatlik kompozittir ve numune alma yetkisi olan laboratuvar tarafından alınır.</w:t>
       </w:r>
     </w:p>
     <w:p>
@@ -1616,7 +1616,7 @@
           <w:i w:val="0"/>
           <w:sz w:val="22"/>
         </w:rPr>
-        <w:t>04.09.2026 iç tetkiki dönemde numune alınmadığını, 24.09.2026 aylık raporu alındığını yazıyor. Analiz raporu sete konmamış. Bir sonraki kampanya, eylül numunesi gerçekten alındıysa Kasım 2026’dadır. Alınmadıysa ilk iş bu numunedir.</w:t>
+        <w:t>Tesis bugün GFB aşamasındadır. Geçici faaliyet belgesi 26.08.2027’ye kadar yürürlüktedir. Bu aşamada periyodik iç izleme alınmaz. Numune Alma Tebliği, iç izleme aralığını atıksu deşarjı konulu çevre izin belgesinin ekine bağlar. Belge henüz çıkmadığı için iç izleme takvimi de başlamamıştır. 24.09.2026 aylık raporunda numune alındığı yazıyor. İşletmenin kaydı bunun tersini söylüyor: iç izleme yoktur. Sonraki aylık raporda bu cümle düzeltilecek. Çevre izni başvurusuna esas numune, periyodik iç izleme değildir. Uygunluk yazısı için alınmış bir numune varsa izin dosyasında kalır, iç izleme serisine yazılmaz. İlk iç izleme, beş yıllık çevre izin belgesi düzenlendikten sonra ekteki sıklıkla alınır. 51-200 m³/gün için bu, aksi yazılmadıkça iki ayda birdir.</w:t>
       </w:r>
     </w:p>
     <w:p>
@@ -2606,7 +2606,7 @@
           <w:color w:val="1B4F72"/>
           <w:sz w:val="24"/>
         </w:rPr>
-        <w:t>Y-02  Kritik  —  İç izleme sonucu ortada yok</w:t>
+        <w:t>Y-02  Düşük  —  İç izleme GFB’de alınmaz</w:t>
       </w:r>
     </w:p>
     <w:p>
@@ -2620,7 +2620,7 @@
           <w:i w:val="0"/>
           <w:sz w:val="22"/>
         </w:rPr>
-        <w:t>İki rapor birbiriyle çelişiyor. Analiz, numune tutanağı ve o günkü debi bulunacak. KOİ 150 mg/L, AKM 200 mg/L ve pH 6-9 ile kıyaslanacak. Aşım varsa bildirim ve on iş günündeki iki ek numune kontrol edilecek. Rapor yoksa yetkili laboratuvarla iki saatlik kompozit bu hafta planlanacak. Sonuç görülmeden limitlere uygun cümlesi hiçbir yazıya konmayacak. Hedef 07.10.2026.</w:t>
+        <w:t>Tesisin periyodik iç izlemesi yoktur. GFB yürürlükteyken bu numune alınmaz. İç izleme, atıksu deşarjı konulu çevre izin belgesi çıktıktan sonra, belgenin ekindeki aralıkla başlar. 24.09.2026 aylık rapordaki iç izleme alındı cümlesi hatalıdır. Sonraki aylık raporda GFB aşamasında iç izleme yapılmadığı yazılacak. İzne esas numune ile periyodik iç izleme birbirine karıştırılmayacak. Hedef, cümlenin düzeltilmesi için 31.10.2026.</w:t>
       </w:r>
     </w:p>
     <w:p>
@@ -3003,7 +3003,7 @@
                 <w:color w:val="1C2833"/>
                 <w:sz w:val="18"/>
               </w:rPr>
-              <w:t>07.10.2026</w:t>
+              <w:t>15.10.2026</w:t>
             </w:r>
           </w:p>
         </w:tc>
@@ -3031,7 +3031,7 @@
                 <w:color w:val="1C2833"/>
                 <w:sz w:val="18"/>
               </w:rPr>
-              <w:t>Eylül iç izleme raporunu bul veya numuneyi planla</w:t>
+              <w:t>Hat yürüyüşü, e-İzin çıktısı, debi defteri, bypass kilidi, klor ölçümü</w:t>
             </w:r>
           </w:p>
         </w:tc>
@@ -3065,7 +3065,7 @@
                 <w:color w:val="1C2833"/>
                 <w:sz w:val="18"/>
               </w:rPr>
-              <w:t>15.10.2026</w:t>
+              <w:t>31.10.2026</w:t>
             </w:r>
           </w:p>
         </w:tc>
@@ -3094,7 +3094,7 @@
                 <w:color w:val="1C2833"/>
                 <w:sz w:val="18"/>
               </w:rPr>
-              <w:t>Hat yürüyüşü, e-İzin çıktısı, debi defteri, bypass kilidi, klor ölçümü</w:t>
+              <w:t>Tesis sorumlusu, atık sözleşmesi, çamur analizi, DSİ belgesi, aylık rapordaki iç izleme cümlesinin düzeltilmesi</w:t>
             </w:r>
           </w:p>
         </w:tc>
@@ -3127,7 +3127,7 @@
                 <w:color w:val="1C2833"/>
                 <w:sz w:val="18"/>
               </w:rPr>
-              <w:t>31.10.2026</w:t>
+              <w:t>Çevre izin belgesi tarihi</w:t>
             </w:r>
           </w:p>
         </w:tc>
@@ -3155,7 +3155,7 @@
                 <w:color w:val="1C2833"/>
                 <w:sz w:val="18"/>
               </w:rPr>
-              <w:t>Tesis sorumlusu, atık sözleşmesi, çamur analizi, DSİ belgesi, personel sayısı, evrak düzeltmesi</w:t>
+              <w:t>İlk periyodik iç izleme bu tarihten sonra, ekteki sıklıkla. GFB bitene kadar iç izleme alınmaz</w:t>
             </w:r>
           </w:p>
         </w:tc>
@@ -3189,7 +3189,7 @@
                 <w:color w:val="1C2833"/>
                 <w:sz w:val="18"/>
               </w:rPr>
-              <w:t>Kasım 2026</w:t>
+              <w:t>15.01.2027</w:t>
             </w:r>
           </w:p>
         </w:tc>
@@ -3197,67 +3197,6 @@
           <w:tcPr>
             <w:tcW w:type="dxa" w:w="4989"/>
             <w:shd w:fill="F4F6F7" w:val="clear"/>
-            <w:tcBorders>
-              <w:top w:val="single" w:sz="4" w:color="D5D8DC"/>
-              <w:left w:val="single" w:sz="4" w:color="D5D8DC"/>
-              <w:bottom w:val="single" w:sz="4" w:color="D5D8DC"/>
-              <w:right w:val="single" w:sz="4" w:color="D5D8DC"/>
-            </w:tcBorders>
-            <w:tcW w:w="7179" w:type="dxa"/>
-          </w:tcPr>
-          <w:p>
-            <w:pPr>
-              <w:spacing w:after="0" w:before="0"/>
-            </w:pPr>
-            <w:r/>
-            <w:r>
-              <w:rPr>
-                <w:rFonts w:ascii="Calibri" w:hAnsi="Calibri" w:eastAsia="Calibri"/>
-                <w:b w:val="0"/>
-                <w:i w:val="0"/>
-                <w:color w:val="1C2833"/>
-                <w:sz w:val="18"/>
-              </w:rPr>
-              <w:t>İkinci iç izleme, eylül numunesinden iki ay sonra</w:t>
-            </w:r>
-          </w:p>
-        </w:tc>
-      </w:tr>
-      <w:tr>
-        <w:trPr>
-          <w:cantSplit/>
-        </w:trPr>
-        <w:tc>
-          <w:tcPr>
-            <w:tcW w:type="dxa" w:w="4989"/>
-            <w:tcBorders>
-              <w:top w:val="single" w:sz="4" w:color="D5D8DC"/>
-              <w:left w:val="single" w:sz="4" w:color="D5D8DC"/>
-              <w:bottom w:val="single" w:sz="4" w:color="D5D8DC"/>
-              <w:right w:val="single" w:sz="4" w:color="D5D8DC"/>
-            </w:tcBorders>
-            <w:tcW w:w="2800" w:type="dxa"/>
-          </w:tcPr>
-          <w:p>
-            <w:pPr>
-              <w:spacing w:after="0" w:before="0"/>
-            </w:pPr>
-            <w:r/>
-            <w:r>
-              <w:rPr>
-                <w:rFonts w:ascii="Calibri" w:hAnsi="Calibri" w:eastAsia="Calibri"/>
-                <w:b w:val="0"/>
-                <w:i w:val="0"/>
-                <w:color w:val="1C2833"/>
-                <w:sz w:val="18"/>
-              </w:rPr>
-              <w:t>15.01.2027</w:t>
-            </w:r>
-          </w:p>
-        </w:tc>
-        <w:tc>
-          <w:tcPr>
-            <w:tcW w:type="dxa" w:w="4989"/>
             <w:tcBorders>
               <w:top w:val="single" w:sz="4" w:color="D5D8DC"/>
               <w:left w:val="single" w:sz="4" w:color="D5D8DC"/>
@@ -3291,7 +3230,6 @@
         <w:tc>
           <w:tcPr>
             <w:tcW w:type="dxa" w:w="4989"/>
-            <w:shd w:fill="F4F6F7" w:val="clear"/>
             <w:tcBorders>
               <w:top w:val="single" w:sz="4" w:color="D5D8DC"/>
               <w:left w:val="single" w:sz="4" w:color="D5D8DC"/>
@@ -3320,7 +3258,6 @@
         <w:tc>
           <w:tcPr>
             <w:tcW w:type="dxa" w:w="4989"/>
-            <w:shd w:fill="F4F6F7" w:val="clear"/>
             <w:tcBorders>
               <w:top w:val="single" w:sz="4" w:color="D5D8DC"/>
               <w:left w:val="single" w:sz="4" w:color="D5D8DC"/>
@@ -3354,6 +3291,7 @@
         <w:tc>
           <w:tcPr>
             <w:tcW w:type="dxa" w:w="4989"/>
+            <w:shd w:fill="F4F6F7" w:val="clear"/>
             <w:tcBorders>
               <w:top w:val="single" w:sz="4" w:color="D5D8DC"/>
               <w:left w:val="single" w:sz="4" w:color="D5D8DC"/>
@@ -3382,6 +3320,7 @@
         <w:tc>
           <w:tcPr>
             <w:tcW w:type="dxa" w:w="4989"/>
+            <w:shd w:fill="F4F6F7" w:val="clear"/>
             <w:tcBorders>
               <w:top w:val="single" w:sz="4" w:color="D5D8DC"/>
               <w:left w:val="single" w:sz="4" w:color="D5D8DC"/>
@@ -3415,7 +3354,6 @@
         <w:tc>
           <w:tcPr>
             <w:tcW w:type="dxa" w:w="4989"/>
-            <w:shd w:fill="F4F6F7" w:val="clear"/>
             <w:tcBorders>
               <w:top w:val="single" w:sz="4" w:color="D5D8DC"/>
               <w:left w:val="single" w:sz="4" w:color="D5D8DC"/>
@@ -3444,7 +3382,6 @@
         <w:tc>
           <w:tcPr>
             <w:tcW w:type="dxa" w:w="4989"/>
-            <w:shd w:fill="F4F6F7" w:val="clear"/>
             <w:tcBorders>
               <w:top w:val="single" w:sz="4" w:color="D5D8DC"/>
               <w:left w:val="single" w:sz="4" w:color="D5D8DC"/>
@@ -3478,6 +3415,7 @@
         <w:tc>
           <w:tcPr>
             <w:tcW w:type="dxa" w:w="4989"/>
+            <w:shd w:fill="F4F6F7" w:val="clear"/>
             <w:tcBorders>
               <w:top w:val="single" w:sz="4" w:color="D5D8DC"/>
               <w:left w:val="single" w:sz="4" w:color="D5D8DC"/>
@@ -3506,6 +3444,7 @@
         <w:tc>
           <w:tcPr>
             <w:tcW w:type="dxa" w:w="4989"/>
+            <w:shd w:fill="F4F6F7" w:val="clear"/>
             <w:tcBorders>
               <w:top w:val="single" w:sz="4" w:color="D5D8DC"/>
               <w:left w:val="single" w:sz="4" w:color="D5D8DC"/>
@@ -3539,7 +3478,6 @@
         <w:tc>
           <w:tcPr>
             <w:tcW w:type="dxa" w:w="4989"/>
-            <w:shd w:fill="F4F6F7" w:val="clear"/>
             <w:tcBorders>
               <w:top w:val="single" w:sz="4" w:color="D5D8DC"/>
               <w:left w:val="single" w:sz="4" w:color="D5D8DC"/>
@@ -3568,7 +3506,6 @@
         <w:tc>
           <w:tcPr>
             <w:tcW w:type="dxa" w:w="4989"/>
-            <w:shd w:fill="F4F6F7" w:val="clear"/>
             <w:tcBorders>
               <w:top w:val="single" w:sz="4" w:color="D5D8DC"/>
               <w:left w:val="single" w:sz="4" w:color="D5D8DC"/>
@@ -3628,7 +3565,7 @@
           <w:i w:val="0"/>
           <w:sz w:val="22"/>
         </w:rPr>
-        <w:t>1.  Sonuç görülmeden uygunluk yazılmaz. Aylık rapordaki ‘numune alındı’ cümlesi limit uygunluğu değildir.</w:t>
+        <w:t>1.  GFB aşamasında periyodik iç izleme alınmaz. Tesisin iç izlemesi yoktur. İlk numune, çevre izin belgesi çıktıktan sonra ekteki sıklıkla alınır.</w:t>
       </w:r>
     </w:p>
     <w:p>
@@ -4229,7 +4166,7 @@
                 <w:color w:val="1C2833"/>
                 <w:sz w:val="18"/>
               </w:rPr>
-              <w:t>KOİ, AKM, pH girilince uygun veya aşım kendiliğinden yazılır</w:t>
+              <w:t>GFB sürerken boş kalır. İzin çıkınca KOİ, AKM ve pH girilir</w:t>
             </w:r>
           </w:p>
         </w:tc>
@@ -5041,7 +4978,7 @@
                 <w:color w:val="1C2833"/>
                 <w:sz w:val="18"/>
               </w:rPr>
-              <w:t>GFB, uygunluk, numune alındı beyanı, personel 49, eğitim</w:t>
+              <w:t>GFB ve uygunluk. İç izleme alındı cümlesi hatalı, düzeltilir</w:t>
             </w:r>
           </w:p>
         </w:tc>
@@ -5064,7 +5001,7 @@
           <w:color w:val="5D6D7E"/>
           <w:sz w:val="20"/>
         </w:rPr>
-        <w:t>Hazırlayan notu: Metin, çevre danışmanının saha öncesi çalışma dosyasıdır. KBRÇEV raporlarının yerine geçmez, onların üzerine okunur. Saha yürüyüşü ve analiz raporu geldikten sonra Y-01 ve Y-02 kapanır, ancak ondan sonra deşarj için bir uygunluk cümlesi kurulabilir.</w:t>
+        <w:t>Hazırlayan notu: Metin, çevre danışmanının saha öncesi çalışma dosyasıdır. KBRÇEV raporlarının yerine geçmez. GFB aşamasında iç izleme alınmayacaktır. Deşarj uygunluğu, çevre izin belgesinden sonraki ilk iç izleme ile kurulur.</w:t>
       </w:r>
     </w:p>
     <w:sectPr>

</xml_diff>